<commit_message>
Add Trust values criterion (Kind/Collaborative/Expert/Aspirational) to person spec mapping
</commit_message>
<xml_diff>
--- a/nursing/oyetoro_adeyemi/Oyetoro_Adeyemi_Interview_and_Medication_Prep_Pack.docx
+++ b/nursing/oyetoro_adeyemi/Oyetoro_Adeyemi_Interview_and_Medication_Prep_Pack.docx
@@ -416,6 +416,36 @@
               <w:t>Surgical: pre/post-op assessment, wound and surgical-site infection signs, VTE/DVT prophylaxis, fluid balance, recognising post-op complications early.</w:t>
               <w:br/>
               <w:t>Oncology/Palliative: symptom management, anticipatory medication, syringe drivers, holistic end-of-life and family support.</w:t>
+            </w:r>
+          </w:p>
+        </w:tc>
+      </w:tr>
+      <w:tr>
+        <w:tc>
+          <w:tcPr>
+            <w:tcW w:type="dxa" w:w="2592"/>
+          </w:tcPr>
+          <w:p>
+            <w:r>
+              <w:rPr>
+                <w:sz w:val="21"/>
+              </w:rPr>
+              <w:t>Demonstrate ability to</w:t>
+              <w:br/>
+              <w:t>meet Trust values</w:t>
+            </w:r>
+          </w:p>
+        </w:tc>
+        <w:tc>
+          <w:tcPr>
+            <w:tcW w:type="dxa" w:w="6768"/>
+          </w:tcPr>
+          <w:p>
+            <w:r>
+              <w:rPr>
+                <w:sz w:val="21"/>
+              </w:rPr>
+              <w:t>Imperial's values are Kind, Collaborative, Expert, Aspirational. Kind: prioritised a distressed relative's need for five quiet minutes over rushing back to task. Collaborative: works daily across physiotherapy, OT, SALT and medical teams, valuing each discipline's expertise. Expert: builds structured clinical knowledge (NEWS2, A-E assessment, medication safety) methodically rather than by guesswork. Aspirational: actively seeking to grow from HCA into registered practice through further study, and plans to keep developing post-registration through preceptorship and CPD.</w:t>
             </w:r>
           </w:p>
         </w:tc>

</xml_diff>